<commit_message>
Refresh the methodology from its Google Doc
</commit_message>
<xml_diff>
--- a/methodology/methodology.docx
+++ b/methodology/methodology.docx
@@ -72,12 +72,12 @@
             <wp:extent cx="2871788" cy="1763997"/>
             <wp:effectExtent b="12700" l="12700" r="12700" t="12700"/>
             <wp:wrapSquare wrapText="bothSides" distB="114300" distT="114300" distL="114300" distR="114300"/>
-            <wp:docPr id="2" name="image3.png"/>
+            <wp:docPr id="2" name="image2.png"/>
             <a:graphic>
               <a:graphicData uri="http://schemas.openxmlformats.org/drawingml/2006/picture">
                 <pic:pic>
                   <pic:nvPicPr>
-                    <pic:cNvPr id="0" name="image3.png"/>
+                    <pic:cNvPr id="0" name="image2.png"/>
                     <pic:cNvPicPr preferRelativeResize="0"/>
                   </pic:nvPicPr>
                   <pic:blipFill>
@@ -109,7 +109,7 @@
     </w:p>
     <w:sdt>
       <w:sdtPr>
-        <w:id w:val="1042039709"/>
+        <w:id w:val="248646382"/>
         <w:docPartObj>
           <w:docPartGallery w:val="Table of Contents"/>
           <w:docPartUnique w:val="1"/>
@@ -5142,16 +5142,6 @@
             <w:r>
               <w:rPr>
                 <w:rFonts w:ascii="Calibri" w:cs="Calibri" w:eastAsia="Calibri" w:hAnsi="Calibri"/>
-                <w:color w:val="467886"/>
-                <w:sz w:val="20"/>
-                <w:szCs w:val="20"/>
-                <w:rtl w:val="0"/>
-              </w:rPr>
-              <w:t xml:space="preserve">[SB2]</w:t>
-            </w:r>
-            <w:r>
-              <w:rPr>
-                <w:rFonts w:ascii="Calibri" w:cs="Calibri" w:eastAsia="Calibri" w:hAnsi="Calibri"/>
                 <w:sz w:val="20"/>
                 <w:szCs w:val="20"/>
                 <w:rtl w:val="0"/>
@@ -8279,12 +8269,12 @@
           <wp:inline distB="114300" distT="114300" distL="114300" distR="114300">
             <wp:extent cx="5943600" cy="7302500"/>
             <wp:effectExtent b="0" l="0" r="0" t="0"/>
-            <wp:docPr id="1" name="image2.png"/>
+            <wp:docPr id="1" name="image3.png"/>
             <a:graphic>
               <a:graphicData uri="http://schemas.openxmlformats.org/drawingml/2006/picture">
                 <pic:pic>
                   <pic:nvPicPr>
-                    <pic:cNvPr id="0" name="image2.png"/>
+                    <pic:cNvPr id="0" name="image3.png"/>
                     <pic:cNvPicPr preferRelativeResize="0"/>
                   </pic:nvPicPr>
                   <pic:blipFill>

</xml_diff>